<commit_message>
Update registration tasks and project docs
</commit_message>
<xml_diff>
--- a/backend/app/document_generation/documents/act_safety_level_of_ISPDn/template.docx
+++ b/backend/app/document_generation/documents/act_safety_level_of_ISPDn/template.docx
@@ -654,6 +654,10 @@
         <w:pStyle w:val="Standard"/>
         <w:spacing w:before="240" w:after="240"/>
         <w:jc w:val="both"/>
+        <w:rPr>
+          <w:sz w:val="24"/>
+          <w:szCs w:val="24"/>
+        </w:rPr>
       </w:pPr>
       <w:r>
         <w:rPr>
@@ -667,10 +671,6 @@
       <w:tblPr>
         <w:tblW w:w="0" w:type="auto"/>
         <w:tblBorders>
-          <w:top w:val="nil"/>
-          <w:left w:val="nil"/>
-          <w:bottom w:val="nil"/>
-          <w:right w:val="nil"/>
           <w:insideH w:val="nil"/>
           <w:insideV w:val="nil"/>
         </w:tblBorders>
@@ -683,11 +683,20 @@
         <w:tc>
           <w:tcPr>
             <w:tcW w:w="9356" w:type="dxa"/>
+            <w:tcBorders>
+              <w:top w:val="nil"/>
+              <w:left w:val="nil"/>
+              <w:bottom w:val="nil"/>
+              <w:right w:val="nil"/>
+            </w:tcBorders>
+            <w:hideMark/>
           </w:tcPr>
           <w:p>
             <w:pPr>
-              <w:rPr>
-                <w:rFonts w:ascii="Times New Roman" w:hAnsi="Times New Roman" w:cs="Times New Roman"/>
+              <w:pStyle w:val="Standard"/>
+              <w:spacing w:before="238" w:line="360" w:lineRule="auto"/>
+              <w:jc w:val="both"/>
+              <w:rPr>
                 <w:sz w:val="24"/>
                 <w:szCs w:val="24"/>
                 <w:lang w:val="en-US"/>
@@ -695,7 +704,6 @@
             </w:pPr>
             <w:r>
               <w:rPr>
-                <w:rFonts w:ascii="Times New Roman" w:hAnsi="Times New Roman" w:cs="Times New Roman"/>
                 <w:sz w:val="24"/>
                 <w:szCs w:val="24"/>
                 <w:lang w:val="en-US"/>
@@ -705,7 +713,6 @@
             <w:proofErr w:type="spellStart"/>
             <w:r>
               <w:rPr>
-                <w:rFonts w:ascii="Times New Roman" w:hAnsi="Times New Roman" w:cs="Times New Roman"/>
                 <w:sz w:val="24"/>
                 <w:szCs w:val="24"/>
                 <w:lang w:val="en-US"/>
@@ -715,7 +722,6 @@
             <w:proofErr w:type="spellEnd"/>
             <w:r>
               <w:rPr>
-                <w:rFonts w:ascii="Times New Roman" w:hAnsi="Times New Roman" w:cs="Times New Roman"/>
                 <w:sz w:val="24"/>
                 <w:szCs w:val="24"/>
                 <w:lang w:val="en-US"/>
@@ -729,11 +735,24 @@
         <w:tc>
           <w:tcPr>
             <w:tcW w:w="9356" w:type="dxa"/>
+            <w:tcBorders>
+              <w:top w:val="nil"/>
+              <w:left w:val="nil"/>
+              <w:bottom w:val="nil"/>
+              <w:right w:val="nil"/>
+            </w:tcBorders>
+            <w:hideMark/>
           </w:tcPr>
           <w:p>
             <w:pPr>
-              <w:rPr>
-                <w:rFonts w:ascii="Times New Roman" w:hAnsi="Times New Roman" w:cs="Times New Roman"/>
+              <w:pStyle w:val="Standard"/>
+              <w:numPr>
+                <w:ilvl w:val="0"/>
+                <w:numId w:val="7"/>
+              </w:numPr>
+              <w:spacing w:before="238" w:line="360" w:lineRule="auto"/>
+              <w:jc w:val="both"/>
+              <w:rPr>
                 <w:sz w:val="24"/>
                 <w:szCs w:val="24"/>
               </w:rPr>
@@ -741,7 +760,6 @@
             <w:proofErr w:type="gramStart"/>
             <w:r>
               <w:rPr>
-                <w:rFonts w:ascii="Times New Roman" w:hAnsi="Times New Roman" w:cs="Times New Roman"/>
                 <w:sz w:val="24"/>
                 <w:szCs w:val="24"/>
               </w:rPr>
@@ -750,7 +768,6 @@
             <w:proofErr w:type="gramEnd"/>
             <w:r>
               <w:rPr>
-                <w:rFonts w:ascii="Times New Roman" w:hAnsi="Times New Roman" w:cs="Times New Roman"/>
                 <w:sz w:val="24"/>
                 <w:szCs w:val="24"/>
               </w:rPr>
@@ -763,18 +780,26 @@
         <w:tc>
           <w:tcPr>
             <w:tcW w:w="9356" w:type="dxa"/>
+            <w:tcBorders>
+              <w:top w:val="nil"/>
+              <w:left w:val="nil"/>
+              <w:bottom w:val="nil"/>
+              <w:right w:val="nil"/>
+            </w:tcBorders>
+            <w:hideMark/>
           </w:tcPr>
           <w:p>
             <w:pPr>
-              <w:rPr>
-                <w:rFonts w:ascii="Times New Roman" w:hAnsi="Times New Roman" w:cs="Times New Roman"/>
+              <w:pStyle w:val="Standard"/>
+              <w:spacing w:before="238" w:line="360" w:lineRule="auto"/>
+              <w:jc w:val="both"/>
+              <w:rPr>
                 <w:sz w:val="24"/>
                 <w:szCs w:val="24"/>
               </w:rPr>
             </w:pPr>
             <w:r>
               <w:rPr>
-                <w:rFonts w:ascii="Times New Roman" w:hAnsi="Times New Roman" w:cs="Times New Roman"/>
                 <w:sz w:val="24"/>
                 <w:szCs w:val="24"/>
               </w:rPr>
@@ -783,7 +808,6 @@
             <w:proofErr w:type="spellStart"/>
             <w:r>
               <w:rPr>
-                <w:rFonts w:ascii="Times New Roman" w:hAnsi="Times New Roman" w:cs="Times New Roman"/>
                 <w:sz w:val="24"/>
                 <w:szCs w:val="24"/>
               </w:rPr>
@@ -792,7 +816,6 @@
             <w:proofErr w:type="spellEnd"/>
             <w:r>
               <w:rPr>
-                <w:rFonts w:ascii="Times New Roman" w:hAnsi="Times New Roman" w:cs="Times New Roman"/>
                 <w:sz w:val="24"/>
                 <w:szCs w:val="24"/>
               </w:rPr>
@@ -801,7 +824,6 @@
             <w:proofErr w:type="spellStart"/>
             <w:r>
               <w:rPr>
-                <w:rFonts w:ascii="Times New Roman" w:hAnsi="Times New Roman" w:cs="Times New Roman"/>
                 <w:sz w:val="24"/>
                 <w:szCs w:val="24"/>
               </w:rPr>
@@ -810,7 +832,6 @@
             <w:proofErr w:type="spellEnd"/>
             <w:r>
               <w:rPr>
-                <w:rFonts w:ascii="Times New Roman" w:hAnsi="Times New Roman" w:cs="Times New Roman"/>
                 <w:sz w:val="24"/>
                 <w:szCs w:val="24"/>
               </w:rPr>
@@ -1428,7 +1449,16 @@
                 <w:sz w:val="24"/>
                 <w:szCs w:val="24"/>
               </w:rPr>
-              <w:t xml:space="preserve"> }}</w:t>
+              <w:t xml:space="preserve"> </w:t>
+            </w:r>
+            <w:r>
+              <w:rPr>
+                <w:rFonts w:ascii="Times New Roman" w:hAnsi="Times New Roman" w:cs="Times New Roman"/>
+                <w:sz w:val="24"/>
+                <w:szCs w:val="24"/>
+              </w:rPr>
+              <w:lastRenderedPageBreak/>
+              <w:t>}}</w:t>
             </w:r>
           </w:p>
         </w:tc>
@@ -1451,7 +1481,17 @@
                 <w:sz w:val="24"/>
                 <w:szCs w:val="24"/>
               </w:rPr>
-              <w:t>{{ member</w:t>
+              <w:lastRenderedPageBreak/>
+              <w:t xml:space="preserve">{{ </w:t>
+            </w:r>
+            <w:r>
+              <w:rPr>
+                <w:rFonts w:ascii="Times New Roman" w:hAnsi="Times New Roman" w:cs="Times New Roman"/>
+                <w:sz w:val="24"/>
+                <w:szCs w:val="24"/>
+              </w:rPr>
+              <w:lastRenderedPageBreak/>
+              <w:t>member</w:t>
             </w:r>
             <w:proofErr w:type="gramEnd"/>
             <w:r>
@@ -1483,6 +1523,7 @@
                 <w:sz w:val="24"/>
                 <w:szCs w:val="24"/>
               </w:rPr>
+              <w:lastRenderedPageBreak/>
               <w:t>{{ member</w:t>
             </w:r>
             <w:proofErr w:type="gramEnd"/>
@@ -1745,6 +1786,119 @@
     </w:lvl>
   </w:abstractNum>
   <w:abstractNum w:abstractNumId="1" w15:restartNumberingAfterBreak="0">
+    <w:nsid w:val="284F18F2"/>
+    <w:multiLevelType w:val="hybridMultilevel"/>
+    <w:tmpl w:val="85826970"/>
+    <w:lvl w:ilvl="0" w:tplc="04190001">
+      <w:start w:val="1"/>
+      <w:numFmt w:val="bullet"/>
+      <w:lvlText w:val=""/>
+      <w:lvlJc w:val="left"/>
+      <w:pPr>
+        <w:ind w:left="720" w:hanging="360"/>
+      </w:pPr>
+      <w:rPr>
+        <w:rFonts w:ascii="Symbol" w:hAnsi="Symbol" w:hint="default"/>
+      </w:rPr>
+    </w:lvl>
+    <w:lvl w:ilvl="1" w:tplc="04190003" w:tentative="1">
+      <w:start w:val="1"/>
+      <w:numFmt w:val="bullet"/>
+      <w:lvlText w:val="o"/>
+      <w:lvlJc w:val="left"/>
+      <w:pPr>
+        <w:ind w:left="1440" w:hanging="360"/>
+      </w:pPr>
+      <w:rPr>
+        <w:rFonts w:ascii="Courier New" w:hAnsi="Courier New" w:cs="Courier New" w:hint="default"/>
+      </w:rPr>
+    </w:lvl>
+    <w:lvl w:ilvl="2" w:tplc="04190005" w:tentative="1">
+      <w:start w:val="1"/>
+      <w:numFmt w:val="bullet"/>
+      <w:lvlText w:val=""/>
+      <w:lvlJc w:val="left"/>
+      <w:pPr>
+        <w:ind w:left="2160" w:hanging="360"/>
+      </w:pPr>
+      <w:rPr>
+        <w:rFonts w:ascii="Wingdings" w:hAnsi="Wingdings" w:hint="default"/>
+      </w:rPr>
+    </w:lvl>
+    <w:lvl w:ilvl="3" w:tplc="04190001" w:tentative="1">
+      <w:start w:val="1"/>
+      <w:numFmt w:val="bullet"/>
+      <w:lvlText w:val=""/>
+      <w:lvlJc w:val="left"/>
+      <w:pPr>
+        <w:ind w:left="2880" w:hanging="360"/>
+      </w:pPr>
+      <w:rPr>
+        <w:rFonts w:ascii="Symbol" w:hAnsi="Symbol" w:hint="default"/>
+      </w:rPr>
+    </w:lvl>
+    <w:lvl w:ilvl="4" w:tplc="04190003" w:tentative="1">
+      <w:start w:val="1"/>
+      <w:numFmt w:val="bullet"/>
+      <w:lvlText w:val="o"/>
+      <w:lvlJc w:val="left"/>
+      <w:pPr>
+        <w:ind w:left="3600" w:hanging="360"/>
+      </w:pPr>
+      <w:rPr>
+        <w:rFonts w:ascii="Courier New" w:hAnsi="Courier New" w:cs="Courier New" w:hint="default"/>
+      </w:rPr>
+    </w:lvl>
+    <w:lvl w:ilvl="5" w:tplc="04190005" w:tentative="1">
+      <w:start w:val="1"/>
+      <w:numFmt w:val="bullet"/>
+      <w:lvlText w:val=""/>
+      <w:lvlJc w:val="left"/>
+      <w:pPr>
+        <w:ind w:left="4320" w:hanging="360"/>
+      </w:pPr>
+      <w:rPr>
+        <w:rFonts w:ascii="Wingdings" w:hAnsi="Wingdings" w:hint="default"/>
+      </w:rPr>
+    </w:lvl>
+    <w:lvl w:ilvl="6" w:tplc="04190001" w:tentative="1">
+      <w:start w:val="1"/>
+      <w:numFmt w:val="bullet"/>
+      <w:lvlText w:val=""/>
+      <w:lvlJc w:val="left"/>
+      <w:pPr>
+        <w:ind w:left="5040" w:hanging="360"/>
+      </w:pPr>
+      <w:rPr>
+        <w:rFonts w:ascii="Symbol" w:hAnsi="Symbol" w:hint="default"/>
+      </w:rPr>
+    </w:lvl>
+    <w:lvl w:ilvl="7" w:tplc="04190003" w:tentative="1">
+      <w:start w:val="1"/>
+      <w:numFmt w:val="bullet"/>
+      <w:lvlText w:val="o"/>
+      <w:lvlJc w:val="left"/>
+      <w:pPr>
+        <w:ind w:left="5760" w:hanging="360"/>
+      </w:pPr>
+      <w:rPr>
+        <w:rFonts w:ascii="Courier New" w:hAnsi="Courier New" w:cs="Courier New" w:hint="default"/>
+      </w:rPr>
+    </w:lvl>
+    <w:lvl w:ilvl="8" w:tplc="04190005" w:tentative="1">
+      <w:start w:val="1"/>
+      <w:numFmt w:val="bullet"/>
+      <w:lvlText w:val=""/>
+      <w:lvlJc w:val="left"/>
+      <w:pPr>
+        <w:ind w:left="6480" w:hanging="360"/>
+      </w:pPr>
+      <w:rPr>
+        <w:rFonts w:ascii="Wingdings" w:hAnsi="Wingdings" w:hint="default"/>
+      </w:rPr>
+    </w:lvl>
+  </w:abstractNum>
+  <w:abstractNum w:abstractNumId="2" w15:restartNumberingAfterBreak="0">
     <w:nsid w:val="3BE6354C"/>
     <w:multiLevelType w:val="multilevel"/>
     <w:tmpl w:val="E32456F0"/>
@@ -1831,7 +1985,120 @@
       </w:pPr>
     </w:lvl>
   </w:abstractNum>
-  <w:abstractNum w:abstractNumId="2" w15:restartNumberingAfterBreak="0">
+  <w:abstractNum w:abstractNumId="3" w15:restartNumberingAfterBreak="0">
+    <w:nsid w:val="4084386B"/>
+    <w:multiLevelType w:val="hybridMultilevel"/>
+    <w:tmpl w:val="49E2EE6C"/>
+    <w:lvl w:ilvl="0" w:tplc="04190001">
+      <w:start w:val="1"/>
+      <w:numFmt w:val="bullet"/>
+      <w:lvlText w:val=""/>
+      <w:lvlJc w:val="left"/>
+      <w:pPr>
+        <w:ind w:left="720" w:hanging="360"/>
+      </w:pPr>
+      <w:rPr>
+        <w:rFonts w:ascii="Symbol" w:hAnsi="Symbol" w:hint="default"/>
+      </w:rPr>
+    </w:lvl>
+    <w:lvl w:ilvl="1" w:tplc="04190003" w:tentative="1">
+      <w:start w:val="1"/>
+      <w:numFmt w:val="bullet"/>
+      <w:lvlText w:val="o"/>
+      <w:lvlJc w:val="left"/>
+      <w:pPr>
+        <w:ind w:left="1440" w:hanging="360"/>
+      </w:pPr>
+      <w:rPr>
+        <w:rFonts w:ascii="Courier New" w:hAnsi="Courier New" w:cs="Courier New" w:hint="default"/>
+      </w:rPr>
+    </w:lvl>
+    <w:lvl w:ilvl="2" w:tplc="04190005" w:tentative="1">
+      <w:start w:val="1"/>
+      <w:numFmt w:val="bullet"/>
+      <w:lvlText w:val=""/>
+      <w:lvlJc w:val="left"/>
+      <w:pPr>
+        <w:ind w:left="2160" w:hanging="360"/>
+      </w:pPr>
+      <w:rPr>
+        <w:rFonts w:ascii="Wingdings" w:hAnsi="Wingdings" w:hint="default"/>
+      </w:rPr>
+    </w:lvl>
+    <w:lvl w:ilvl="3" w:tplc="04190001" w:tentative="1">
+      <w:start w:val="1"/>
+      <w:numFmt w:val="bullet"/>
+      <w:lvlText w:val=""/>
+      <w:lvlJc w:val="left"/>
+      <w:pPr>
+        <w:ind w:left="2880" w:hanging="360"/>
+      </w:pPr>
+      <w:rPr>
+        <w:rFonts w:ascii="Symbol" w:hAnsi="Symbol" w:hint="default"/>
+      </w:rPr>
+    </w:lvl>
+    <w:lvl w:ilvl="4" w:tplc="04190003" w:tentative="1">
+      <w:start w:val="1"/>
+      <w:numFmt w:val="bullet"/>
+      <w:lvlText w:val="o"/>
+      <w:lvlJc w:val="left"/>
+      <w:pPr>
+        <w:ind w:left="3600" w:hanging="360"/>
+      </w:pPr>
+      <w:rPr>
+        <w:rFonts w:ascii="Courier New" w:hAnsi="Courier New" w:cs="Courier New" w:hint="default"/>
+      </w:rPr>
+    </w:lvl>
+    <w:lvl w:ilvl="5" w:tplc="04190005" w:tentative="1">
+      <w:start w:val="1"/>
+      <w:numFmt w:val="bullet"/>
+      <w:lvlText w:val=""/>
+      <w:lvlJc w:val="left"/>
+      <w:pPr>
+        <w:ind w:left="4320" w:hanging="360"/>
+      </w:pPr>
+      <w:rPr>
+        <w:rFonts w:ascii="Wingdings" w:hAnsi="Wingdings" w:hint="default"/>
+      </w:rPr>
+    </w:lvl>
+    <w:lvl w:ilvl="6" w:tplc="04190001" w:tentative="1">
+      <w:start w:val="1"/>
+      <w:numFmt w:val="bullet"/>
+      <w:lvlText w:val=""/>
+      <w:lvlJc w:val="left"/>
+      <w:pPr>
+        <w:ind w:left="5040" w:hanging="360"/>
+      </w:pPr>
+      <w:rPr>
+        <w:rFonts w:ascii="Symbol" w:hAnsi="Symbol" w:hint="default"/>
+      </w:rPr>
+    </w:lvl>
+    <w:lvl w:ilvl="7" w:tplc="04190003" w:tentative="1">
+      <w:start w:val="1"/>
+      <w:numFmt w:val="bullet"/>
+      <w:lvlText w:val="o"/>
+      <w:lvlJc w:val="left"/>
+      <w:pPr>
+        <w:ind w:left="5760" w:hanging="360"/>
+      </w:pPr>
+      <w:rPr>
+        <w:rFonts w:ascii="Courier New" w:hAnsi="Courier New" w:cs="Courier New" w:hint="default"/>
+      </w:rPr>
+    </w:lvl>
+    <w:lvl w:ilvl="8" w:tplc="04190005" w:tentative="1">
+      <w:start w:val="1"/>
+      <w:numFmt w:val="bullet"/>
+      <w:lvlText w:val=""/>
+      <w:lvlJc w:val="left"/>
+      <w:pPr>
+        <w:ind w:left="6480" w:hanging="360"/>
+      </w:pPr>
+      <w:rPr>
+        <w:rFonts w:ascii="Wingdings" w:hAnsi="Wingdings" w:hint="default"/>
+      </w:rPr>
+    </w:lvl>
+  </w:abstractNum>
+  <w:abstractNum w:abstractNumId="4" w15:restartNumberingAfterBreak="0">
     <w:nsid w:val="615E1B03"/>
     <w:multiLevelType w:val="multilevel"/>
     <w:tmpl w:val="060AE6D4"/>
@@ -1900,7 +2167,7 @@
       <w:lvlJc w:val="left"/>
     </w:lvl>
   </w:abstractNum>
-  <w:abstractNum w:abstractNumId="3" w15:restartNumberingAfterBreak="0">
+  <w:abstractNum w:abstractNumId="5" w15:restartNumberingAfterBreak="0">
     <w:nsid w:val="72B274FC"/>
     <w:multiLevelType w:val="multilevel"/>
     <w:tmpl w:val="899E003C"/>
@@ -2006,19 +2273,25 @@
     </w:lvl>
   </w:abstractNum>
   <w:num w:numId="1" w16cid:durableId="1398015322">
-    <w:abstractNumId w:val="1"/>
+    <w:abstractNumId w:val="2"/>
   </w:num>
   <w:num w:numId="2" w16cid:durableId="447512513">
-    <w:abstractNumId w:val="3"/>
+    <w:abstractNumId w:val="5"/>
   </w:num>
   <w:num w:numId="3" w16cid:durableId="1756198403">
-    <w:abstractNumId w:val="2"/>
+    <w:abstractNumId w:val="4"/>
   </w:num>
   <w:num w:numId="4" w16cid:durableId="1685857683">
-    <w:abstractNumId w:val="3"/>
+    <w:abstractNumId w:val="5"/>
   </w:num>
   <w:num w:numId="5" w16cid:durableId="242692172">
     <w:abstractNumId w:val="0"/>
+  </w:num>
+  <w:num w:numId="6" w16cid:durableId="370114079">
+    <w:abstractNumId w:val="3"/>
+  </w:num>
+  <w:num w:numId="7" w16cid:durableId="261451600">
+    <w:abstractNumId w:val="1"/>
   </w:num>
 </w:numbering>
 </file>
@@ -2444,7 +2717,6 @@
   <w:style w:type="character" w:default="1" w:styleId="a0">
     <w:name w:val="Default Paragraph Font"/>
     <w:uiPriority w:val="1"/>
-    <w:semiHidden/>
     <w:unhideWhenUsed/>
   </w:style>
   <w:style w:type="table" w:default="1" w:styleId="a1">

</xml_diff>